<commit_message>
Fix homepage headline: idea to ongoing support, not idea to invoice
The app tracks incoming vendor/contractor invoices, it doesn't generate
outgoing client invoices, so 'idea to invoice' overclaimed. Ongoing
Support (portfolio-wide incident tracking, cost-to-serve, AI pattern
detection) is a real built feature and the actual end of the lifecycle
Keel covers -- updated the marketing homepage headline to match.
</commit_message>
<xml_diff>
--- a/Keel-One-Pager.docx
+++ b/Keel-One-Pager.docx
@@ -245,7 +245,7 @@
                 <w:sz w:val="17"/>
                 <w:szCs w:val="17"/>
               </w:rPr>
-              <w:t xml:space="preserve">Drafts charters, RFPs, risks, tasks, and incidents from a rough note; estimates effort; suggests assignments; briefs you out loud.</w:t>
+              <w:t xml:space="preserve">Drafts charters, RFPs, risks, tasks, and incidents from a rough note; estimates effort; suggests who should do each task — AI, your team, or a vendor; briefs you out loud.</w:t>
             </w:r>
           </w:p>
         </w:tc>
@@ -534,6 +534,19 @@
       </w:r>
     </w:p>
     <w:p>
+      <w:pPr>
+        <w:spacing w:after="100"/>
+      </w:pPr>
+      <w:r>
+        <w:rPr>
+          <w:color w:val="475569"/>
+          <w:sz w:val="19"/>
+          <w:szCs w:val="19"/>
+        </w:rPr>
+        <w:t xml:space="preserve">If this sounds like a problem you're dealing with, comment below or reach out directly — happy to walk you through it.</w:t>
+      </w:r>
+    </w:p>
+    <w:p>
       <w:r>
         <w:rPr>
           <w:color w:val="475569"/>

</xml_diff>